<commit_message>
Fill in seller: AAAD Northwest Environmental Services, Inc.
Pre-fill the seller name in the parties block, name the company as
first lienholder in section 4.2 and on the payment record page, and
switch the seller signature block to corporate form (By / printed name
& title). Seller ID line is now Business ID (UBI/EIN) instead of
driver's license. Buyer fields remain blank.

Co-Authored-By: Claude Fable 5 <noreply@anthropic.com>
Claude-Session: https://claude.ai/code/session_018AngEcjhavgzzPrGnngqXp
</commit_message>
<xml_diff>
--- a/documents/2014-ford-fusion-bill-of-sale.docx
+++ b/documents/2014-ford-fusion-bill-of-sale.docx
@@ -132,6 +132,43 @@
               <w:t xml:space="preserve">Name: </w:t>
             </w:r>
             <w:r>
+              <w:rPr>
+                <w:b/>
+                <w:bCs/>
+              </w:rPr>
+              <w:t xml:space="preserve">AAAD Northwest Environmental Services, Inc.</w:t>
+            </w:r>
+          </w:p>
+          <w:p>
+            <w:pPr>
+              <w:spacing w:after="44"/>
+            </w:pPr>
+            <w:r>
+              <w:t xml:space="preserve">Address: </w:t>
+            </w:r>
+            <w:r>
+              <w:t xml:space="preserve">____________________________</w:t>
+            </w:r>
+          </w:p>
+          <w:p>
+            <w:pPr>
+              <w:spacing w:after="44"/>
+            </w:pPr>
+            <w:r>
+              <w:t xml:space="preserve">City/State/ZIP: </w:t>
+            </w:r>
+            <w:r>
+              <w:t xml:space="preserve">________________________</w:t>
+            </w:r>
+          </w:p>
+          <w:p>
+            <w:pPr>
+              <w:spacing w:after="44"/>
+            </w:pPr>
+            <w:r>
+              <w:t xml:space="preserve">Phone: </w:t>
+            </w:r>
+            <w:r>
               <w:t xml:space="preserve">______________________________</w:t>
             </w:r>
           </w:p>
@@ -140,10 +177,10 @@
               <w:spacing w:after="44"/>
             </w:pPr>
             <w:r>
-              <w:t xml:space="preserve">Address: </w:t>
-            </w:r>
-            <w:r>
-              <w:t xml:space="preserve">____________________________</w:t>
+              <w:t xml:space="preserve">Email: </w:t>
+            </w:r>
+            <w:r>
+              <w:t xml:space="preserve">______________________________</w:t>
             </w:r>
           </w:p>
           <w:p>
@@ -151,43 +188,10 @@
               <w:spacing w:after="44"/>
             </w:pPr>
             <w:r>
-              <w:t xml:space="preserve">City/State/ZIP: </w:t>
-            </w:r>
-            <w:r>
-              <w:t xml:space="preserve">________________________</w:t>
-            </w:r>
-          </w:p>
-          <w:p>
-            <w:pPr>
-              <w:spacing w:after="44"/>
-            </w:pPr>
-            <w:r>
-              <w:t xml:space="preserve">Phone: </w:t>
-            </w:r>
-            <w:r>
-              <w:t xml:space="preserve">______________________________</w:t>
-            </w:r>
-          </w:p>
-          <w:p>
-            <w:pPr>
-              <w:spacing w:after="44"/>
-            </w:pPr>
-            <w:r>
-              <w:t xml:space="preserve">Email: </w:t>
-            </w:r>
-            <w:r>
-              <w:t xml:space="preserve">______________________________</w:t>
-            </w:r>
-          </w:p>
-          <w:p>
-            <w:pPr>
-              <w:spacing w:after="44"/>
-            </w:pPr>
-            <w:r>
-              <w:t xml:space="preserve">Driver's Lic. No.: </w:t>
-            </w:r>
-            <w:r>
-              <w:t xml:space="preserve">______________________</w:t>
+              <w:t xml:space="preserve">Business ID (UBI / EIN): </w:t>
+            </w:r>
+            <w:r>
+              <w:t xml:space="preserve">________________</w:t>
             </w:r>
           </w:p>
         </w:tc>
@@ -739,7 +743,7 @@
           <w:b/>
           <w:bCs/>
         </w:rPr>
-        <w:t xml:space="preserve">Seller recorded as first lienholder</w:t>
+        <w:t xml:space="preserve">Seller (AAAD Northwest Environmental Services, Inc.) recorded as first lienholder</w:t>
       </w:r>
       <w:r>
         <w:t xml:space="preserve">.</w:t>
@@ -1077,7 +1081,7 @@
               <w:spacing w:after="120"/>
             </w:pPr>
             <w:r>
-              <w:t xml:space="preserve">Seller signature: ____________________________________</w:t>
+              <w:t xml:space="preserve">Seller: AAAD Northwest Environmental Services, Inc.</w:t>
             </w:r>
           </w:p>
         </w:tc>
@@ -1096,7 +1100,7 @@
               <w:spacing w:after="120"/>
             </w:pPr>
             <w:r>
-              <w:t xml:space="preserve">Date: ________________</w:t>
+              <w:t xml:space="preserve"/>
             </w:r>
           </w:p>
         </w:tc>
@@ -1120,7 +1124,7 @@
               <w:spacing w:after="120"/>
             </w:pPr>
             <w:r>
-              <w:t xml:space="preserve">Seller printed name: _________________________________</w:t>
+              <w:t xml:space="preserve">By (authorized signature): ____________________________</w:t>
             </w:r>
           </w:p>
         </w:tc>
@@ -1139,7 +1143,7 @@
               <w:spacing w:after="120"/>
             </w:pPr>
             <w:r>
-              <w:t xml:space="preserve"/>
+              <w:t xml:space="preserve">Date: ________________</w:t>
             </w:r>
           </w:p>
         </w:tc>
@@ -1163,7 +1167,7 @@
               <w:spacing w:after="120"/>
             </w:pPr>
             <w:r>
-              <w:t xml:space="preserve">Buyer signature: _____________________________________</w:t>
+              <w:t xml:space="preserve">Printed name &amp; title: ________________________________</w:t>
             </w:r>
           </w:p>
         </w:tc>
@@ -1182,7 +1186,7 @@
               <w:spacing w:after="120"/>
             </w:pPr>
             <w:r>
-              <w:t xml:space="preserve">Date: ________________</w:t>
+              <w:t xml:space="preserve"/>
             </w:r>
           </w:p>
         </w:tc>
@@ -1206,7 +1210,7 @@
               <w:spacing w:after="120"/>
             </w:pPr>
             <w:r>
-              <w:t xml:space="preserve">Buyer printed name: __________________________________</w:t>
+              <w:t xml:space="preserve">Buyer signature: _____________________________________</w:t>
             </w:r>
           </w:p>
         </w:tc>
@@ -1225,6 +1229,49 @@
               <w:spacing w:after="120"/>
             </w:pPr>
             <w:r>
+              <w:t xml:space="preserve">Date: ________________</w:t>
+            </w:r>
+          </w:p>
+        </w:tc>
+      </w:tr>
+      <w:tr>
+        <w:trPr>
+          <w:cantSplit/>
+        </w:trPr>
+        <w:tc>
+          <w:tcPr>
+            <w:tcW w:type="dxa" w:w="6480"/>
+            <w:tcBorders>
+              <w:top w:val="none" w:color="auto" w:sz="0"/>
+              <w:left w:val="none" w:color="auto" w:sz="0"/>
+              <w:bottom w:val="none" w:color="auto" w:sz="0"/>
+              <w:right w:val="none" w:color="auto" w:sz="0"/>
+            </w:tcBorders>
+          </w:tcPr>
+          <w:p>
+            <w:pPr>
+              <w:spacing w:after="120"/>
+            </w:pPr>
+            <w:r>
+              <w:t xml:space="preserve">Buyer printed name: __________________________________</w:t>
+            </w:r>
+          </w:p>
+        </w:tc>
+        <w:tc>
+          <w:tcPr>
+            <w:tcW w:type="dxa" w:w="3600"/>
+            <w:tcBorders>
+              <w:top w:val="none" w:color="auto" w:sz="0"/>
+              <w:left w:val="none" w:color="auto" w:sz="0"/>
+              <w:bottom w:val="none" w:color="auto" w:sz="0"/>
+              <w:right w:val="none" w:color="auto" w:sz="0"/>
+            </w:tcBorders>
+          </w:tcPr>
+          <w:p>
+            <w:pPr>
+              <w:spacing w:after="120"/>
+            </w:pPr>
+            <w:r>
               <w:t xml:space="preserve"/>
             </w:r>
           </w:p>
@@ -1299,6 +1346,22 @@
           <w:rFonts w:ascii="Courier New" w:cs="Courier New" w:eastAsia="Courier New" w:hAnsi="Courier New"/>
         </w:rPr>
         <w:t xml:space="preserve">3FA6P0PU0ER317479</w:t>
+      </w:r>
+    </w:p>
+    <w:p>
+      <w:pPr>
+        <w:spacing w:after="40"/>
+        <w:jc w:val="center"/>
+      </w:pPr>
+      <w:r>
+        <w:t xml:space="preserve">Seller / lienholder: </w:t>
+      </w:r>
+      <w:r>
+        <w:rPr>
+          <w:b/>
+          <w:bCs/>
+        </w:rPr>
+        <w:t xml:space="preserve">AAAD Northwest Environmental Services, Inc.</w:t>
       </w:r>
     </w:p>
     <w:p>

</xml_diff>

<commit_message>
Fill in odometer reading: 177,560 miles
Pre-fill the mileage in the vehicle table and the federal odometer
disclosure statement. The three certification checkboxes are left
unchecked for the seller to mark at signing.

Co-Authored-By: Claude Fable 5 <noreply@anthropic.com>
Claude-Session: https://claude.ai/code/session_018AngEcjhavgzzPrGnngqXp
</commit_message>
<xml_diff>
--- a/documents/2014-ford-fusion-bill-of-sale.docx
+++ b/documents/2014-ford-fusion-bill-of-sale.docx
@@ -440,7 +440,11 @@
               <w:t xml:space="preserve">Odometer: </w:t>
             </w:r>
             <w:r>
-              <w:t xml:space="preserve">______________</w:t>
+              <w:rPr>
+                <w:b/>
+                <w:bCs/>
+              </w:rPr>
+              <w:t xml:space="preserve">177,560</w:t>
             </w:r>
             <w:r>
               <w:t xml:space="preserve"> miles</w:t>
@@ -937,7 +941,11 @@
         <w:t xml:space="preserve">I, the Seller, certify that the odometer reads </w:t>
       </w:r>
       <w:r>
-        <w:t xml:space="preserve">______________</w:t>
+        <w:rPr>
+          <w:b/>
+          <w:bCs/>
+        </w:rPr>
+        <w:t xml:space="preserve">177,560</w:t>
       </w:r>
       <w:r>
         <w:t xml:space="preserve"> miles (no tenths) and (check one):</w:t>

</xml_diff>

<commit_message>
Fill in seller corporate address: 3632 49th Ave NW, Seattle, WA
Pre-fill the seller address lines in the parties block; a short blank
remains after "Seattle, WA" for the ZIP, which was not provided.

Co-Authored-By: Claude Fable 5 <noreply@anthropic.com>
Claude-Session: https://claude.ai/code/session_018AngEcjhavgzzPrGnngqXp
</commit_message>
<xml_diff>
--- a/documents/2014-ford-fusion-bill-of-sale.docx
+++ b/documents/2014-ford-fusion-bill-of-sale.docx
@@ -147,7 +147,11 @@
               <w:t xml:space="preserve">Address: </w:t>
             </w:r>
             <w:r>
-              <w:t xml:space="preserve">____________________________</w:t>
+              <w:rPr>
+                <w:b/>
+                <w:bCs/>
+              </w:rPr>
+              <w:t xml:space="preserve">3632 49th Ave NW</w:t>
             </w:r>
           </w:p>
           <w:p>
@@ -158,7 +162,14 @@
               <w:t xml:space="preserve">City/State/ZIP: </w:t>
             </w:r>
             <w:r>
-              <w:t xml:space="preserve">________________________</w:t>
+              <w:rPr>
+                <w:b/>
+                <w:bCs/>
+              </w:rPr>
+              <w:t xml:space="preserve">Seattle, WA </w:t>
+            </w:r>
+            <w:r>
+              <w:t xml:space="preserve">________</w:t>
             </w:r>
           </w:p>
           <w:p>

</xml_diff>